<commit_message>
Updated office hours page
</commit_message>
<xml_diff>
--- a/syllabus.docx
+++ b/syllabus.docx
@@ -984,25 +984,7 @@
           <w:sz w:val="20"/>
           <w:szCs w:val="20"/>
         </w:rPr>
-        <w:t xml:space="preserve">appointments have </w:t>
-      </w:r>
-      <w:proofErr w:type="gramStart"/>
-      <w:r>
-        <w:rPr>
-          <w:rFonts w:ascii="Times New Roman" w:eastAsia="Times New Roman" w:hAnsi="Times New Roman" w:cs="Times New Roman"/>
-          <w:sz w:val="20"/>
-          <w:szCs w:val="20"/>
-        </w:rPr>
-        <w:t>first priority</w:t>
-      </w:r>
-      <w:proofErr w:type="gramEnd"/>
-      <w:r>
-        <w:rPr>
-          <w:rFonts w:ascii="Times New Roman" w:eastAsia="Times New Roman" w:hAnsi="Times New Roman" w:cs="Times New Roman"/>
-          <w:sz w:val="20"/>
-          <w:szCs w:val="20"/>
-        </w:rPr>
-        <w:t>.  You</w:t>
+        <w:t>appointments have first priority.  You</w:t>
       </w:r>
       <w:r>
         <w:rPr>
@@ -1036,7 +1018,7 @@
             <w:sz w:val="20"/>
             <w:szCs w:val="20"/>
           </w:rPr>
-          <w:t>https://tinyurl.com/diesburg</w:t>
+          <w:t>https://tinyurl.com/drdiesburg001</w:t>
         </w:r>
       </w:hyperlink>
       <w:r>
@@ -1464,25 +1446,7 @@
           <w:sz w:val="20"/>
           <w:szCs w:val="20"/>
         </w:rPr>
-        <w:t xml:space="preserve">Enter </w:t>
-      </w:r>
-      <w:proofErr w:type="spellStart"/>
-      <w:r>
-        <w:rPr>
-          <w:rFonts w:ascii="Times New Roman" w:hAnsi="Times New Roman" w:cs="Times New Roman"/>
-          <w:sz w:val="20"/>
-          <w:szCs w:val="20"/>
-        </w:rPr>
-        <w:t>zyBook</w:t>
-      </w:r>
-      <w:proofErr w:type="spellEnd"/>
-      <w:r>
-        <w:rPr>
-          <w:rFonts w:ascii="Times New Roman" w:hAnsi="Times New Roman" w:cs="Times New Roman"/>
-          <w:sz w:val="20"/>
-          <w:szCs w:val="20"/>
-        </w:rPr>
-        <w:t xml:space="preserve"> code: </w:t>
+        <w:t xml:space="preserve">Enter zyBook code: </w:t>
       </w:r>
       <w:r>
         <w:rPr>
@@ -1823,25 +1787,7 @@
           <w:sz w:val="20"/>
           <w:szCs w:val="20"/>
         </w:rPr>
-        <w:t xml:space="preserve">Students will increase their </w:t>
-      </w:r>
-      <w:proofErr w:type="gramStart"/>
-      <w:r>
-        <w:rPr>
-          <w:rFonts w:ascii="Times New Roman" w:eastAsia="Times New Roman" w:hAnsi="Times New Roman" w:cs="Times New Roman"/>
-          <w:sz w:val="20"/>
-          <w:szCs w:val="20"/>
-        </w:rPr>
-        <w:t>problem solving</w:t>
-      </w:r>
-      <w:proofErr w:type="gramEnd"/>
-      <w:r>
-        <w:rPr>
-          <w:rFonts w:ascii="Times New Roman" w:eastAsia="Times New Roman" w:hAnsi="Times New Roman" w:cs="Times New Roman"/>
-          <w:sz w:val="20"/>
-          <w:szCs w:val="20"/>
-        </w:rPr>
-        <w:t xml:space="preserve"> skills by creating programming solutions to solve real-world problems.</w:t>
+        <w:t>Students will increase their problem solving skills by creating programming solutions to solve real-world problems.</w:t>
       </w:r>
     </w:p>
     <w:p>
@@ -2099,7 +2045,6 @@
         </w:rPr>
         <w:t xml:space="preserve"> </w:t>
       </w:r>
-      <w:proofErr w:type="gramStart"/>
       <w:r>
         <w:rPr>
           <w:spacing w:val="2"/>
@@ -2109,7 +2054,6 @@
       <w:r>
         <w:t>n</w:t>
       </w:r>
-      <w:proofErr w:type="gramEnd"/>
       <w:r>
         <w:rPr>
           <w:spacing w:val="-5"/>
@@ -3778,23 +3722,13 @@
                 <w:szCs w:val="20"/>
               </w:rPr>
             </w:pPr>
-            <w:proofErr w:type="spellStart"/>
             <w:r>
               <w:rPr>
                 <w:rFonts w:ascii="Times New Roman" w:eastAsia="Times New Roman" w:hAnsi="Times New Roman" w:cs="Times New Roman"/>
                 <w:sz w:val="20"/>
                 <w:szCs w:val="20"/>
               </w:rPr>
-              <w:t>zyBook</w:t>
-            </w:r>
-            <w:proofErr w:type="spellEnd"/>
-            <w:r>
-              <w:rPr>
-                <w:rFonts w:ascii="Times New Roman" w:eastAsia="Times New Roman" w:hAnsi="Times New Roman" w:cs="Times New Roman"/>
-                <w:sz w:val="20"/>
-                <w:szCs w:val="20"/>
-              </w:rPr>
-              <w:t xml:space="preserve"> Participation Activities</w:t>
+              <w:t>zyBook Participation Activities</w:t>
             </w:r>
           </w:p>
         </w:tc>
@@ -4045,9 +3979,8 @@
           <w:sz w:val="20"/>
           <w:szCs w:val="20"/>
         </w:rPr>
-        <w:t xml:space="preserve">To </w:t>
-      </w:r>
-      <w:proofErr w:type="gramStart"/>
+        <w:t xml:space="preserve">To continue </w:t>
+      </w:r>
       <w:r>
         <w:rPr>
           <w:rFonts w:ascii="Times New Roman" w:eastAsia="Times New Roman" w:hAnsi="Times New Roman"/>
@@ -4056,28 +3989,7 @@
           <w:sz w:val="20"/>
           <w:szCs w:val="20"/>
         </w:rPr>
-        <w:t xml:space="preserve">continue </w:t>
-      </w:r>
-      <w:r>
-        <w:rPr>
-          <w:rFonts w:ascii="Times New Roman" w:eastAsia="Times New Roman" w:hAnsi="Times New Roman"/>
-          <w:i/>
-          <w:spacing w:val="-1"/>
-          <w:sz w:val="20"/>
-          <w:szCs w:val="20"/>
-        </w:rPr>
-        <w:t>on</w:t>
-      </w:r>
-      <w:proofErr w:type="gramEnd"/>
-      <w:r>
-        <w:rPr>
-          <w:rFonts w:ascii="Times New Roman" w:eastAsia="Times New Roman" w:hAnsi="Times New Roman"/>
-          <w:i/>
-          <w:spacing w:val="-1"/>
-          <w:sz w:val="20"/>
-          <w:szCs w:val="20"/>
-        </w:rPr>
-        <w:t xml:space="preserve"> </w:t>
+        <w:t xml:space="preserve">on </w:t>
       </w:r>
       <w:r>
         <w:rPr>
@@ -4724,21 +4636,7 @@
         <w:rPr>
           <w:spacing w:val="-1"/>
         </w:rPr>
-        <w:t xml:space="preserve"> by watching the recording of the live Zoom lectures (link found on </w:t>
-      </w:r>
-      <w:proofErr w:type="spellStart"/>
-      <w:r>
-        <w:rPr>
-          <w:spacing w:val="-1"/>
-        </w:rPr>
-        <w:t>elearning</w:t>
-      </w:r>
-      <w:proofErr w:type="spellEnd"/>
-      <w:r>
-        <w:rPr>
-          <w:spacing w:val="-1"/>
-        </w:rPr>
-        <w:t>)</w:t>
+        <w:t xml:space="preserve"> by watching the recording of the live Zoom lectures (link found on elearning)</w:t>
       </w:r>
       <w:r>
         <w:rPr>
@@ -4764,19 +4662,11 @@
           <w:spacing w:val="-1"/>
         </w:rPr>
       </w:pPr>
-      <w:proofErr w:type="spellStart"/>
-      <w:r>
-        <w:rPr>
-          <w:spacing w:val="-1"/>
-        </w:rPr>
-        <w:t>ZyBook</w:t>
-      </w:r>
-      <w:proofErr w:type="spellEnd"/>
-      <w:r>
-        <w:rPr>
-          <w:spacing w:val="-1"/>
-        </w:rPr>
-        <w:t xml:space="preserve"> Participation and Challenge Activities</w:t>
+      <w:r>
+        <w:rPr>
+          <w:spacing w:val="-1"/>
+        </w:rPr>
+        <w:t>ZyBook Participation and Challenge Activities</w:t>
       </w:r>
     </w:p>
     <w:p>
@@ -6750,7 +6640,6 @@
         </w:rPr>
         <w:t xml:space="preserve"> </w:t>
       </w:r>
-      <w:proofErr w:type="gramStart"/>
       <w:r>
         <w:rPr>
           <w:spacing w:val="-1"/>
@@ -6799,7 +6688,6 @@
       <w:r>
         <w:t>d</w:t>
       </w:r>
-      <w:proofErr w:type="gramEnd"/>
       <w:r>
         <w:rPr>
           <w:spacing w:val="-3"/>
@@ -6944,7 +6832,6 @@
         </w:rPr>
         <w:t xml:space="preserve"> </w:t>
       </w:r>
-      <w:proofErr w:type="gramStart"/>
       <w:r>
         <w:rPr>
           <w:spacing w:val="-1"/>
@@ -6993,7 +6880,6 @@
       <w:r>
         <w:t>er</w:t>
       </w:r>
-      <w:proofErr w:type="gramEnd"/>
       <w:r>
         <w:rPr>
           <w:spacing w:val="-3"/>
@@ -8526,15 +8412,7 @@
         </w:rPr>
       </w:pPr>
       <w:r>
-        <w:t xml:space="preserve">Create programs(s) that use many or </w:t>
-      </w:r>
-      <w:proofErr w:type="gramStart"/>
-      <w:r>
-        <w:t>all of</w:t>
-      </w:r>
-      <w:proofErr w:type="gramEnd"/>
-      <w:r>
-        <w:t xml:space="preserve"> the above elements to solve problem(s).</w:t>
+        <w:t>Create programs(s) that use many or all of the above elements to solve problem(s).</w:t>
       </w:r>
     </w:p>
     <w:p>
@@ -8551,13 +8429,8 @@
           <w:b/>
         </w:rPr>
       </w:pPr>
-      <w:proofErr w:type="spellStart"/>
-      <w:r>
-        <w:t>Homeworks</w:t>
-      </w:r>
-      <w:proofErr w:type="spellEnd"/>
-      <w:r>
-        <w:t xml:space="preserve"> will by default be assigned after the lab period for which the new concept will be introduced.  Please consult the main website for exact homework due dates and late policies.</w:t>
+      <w:r>
+        <w:t>Homeworks will by default be assigned after the lab period for which the new concept will be introduced.  Please consult the main website for exact homework due dates and late policies.</w:t>
       </w:r>
     </w:p>
     <w:p>
@@ -8635,7 +8508,6 @@
         </w:rPr>
         <w:t xml:space="preserve"> </w:t>
       </w:r>
-      <w:proofErr w:type="gramStart"/>
       <w:r>
         <w:t>a</w:t>
       </w:r>
@@ -8648,7 +8520,6 @@
       <w:r>
         <w:t>e</w:t>
       </w:r>
-      <w:proofErr w:type="gramEnd"/>
       <w:r>
         <w:rPr>
           <w:spacing w:val="-4"/>
@@ -9270,7 +9141,6 @@
         </w:rPr>
         <w:t xml:space="preserve"> </w:t>
       </w:r>
-      <w:proofErr w:type="gramStart"/>
       <w:r>
         <w:rPr>
           <w:rFonts w:cs="Times New Roman"/>
@@ -9314,7 +9184,6 @@
         </w:rPr>
         <w:t>t</w:t>
       </w:r>
-      <w:proofErr w:type="gramEnd"/>
       <w:r>
         <w:rPr>
           <w:rFonts w:cs="Times New Roman"/>
@@ -11997,7 +11866,6 @@
         </w:rPr>
         <w:t xml:space="preserve"> </w:t>
       </w:r>
-      <w:proofErr w:type="gramStart"/>
       <w:r>
         <w:rPr>
           <w:spacing w:val="-1"/>
@@ -12028,7 +11896,6 @@
       <w:r>
         <w:t>er</w:t>
       </w:r>
-      <w:proofErr w:type="gramEnd"/>
       <w:r>
         <w:rPr>
           <w:spacing w:val="-3"/>
@@ -12323,7 +12190,6 @@
         </w:rPr>
         <w:t xml:space="preserve"> </w:t>
       </w:r>
-      <w:proofErr w:type="gramStart"/>
       <w:r>
         <w:rPr>
           <w:spacing w:val="2"/>
@@ -12348,7 +12214,6 @@
       <w:r>
         <w:t>ed</w:t>
       </w:r>
-      <w:proofErr w:type="gramEnd"/>
       <w:r>
         <w:rPr>
           <w:spacing w:val="-3"/>
@@ -12601,7 +12466,6 @@
         </w:rPr>
         <w:t xml:space="preserve"> </w:t>
       </w:r>
-      <w:proofErr w:type="gramStart"/>
       <w:r>
         <w:t>a</w:t>
       </w:r>
@@ -12662,7 +12526,6 @@
       <w:r>
         <w:t>-</w:t>
       </w:r>
-      <w:proofErr w:type="gramEnd"/>
       <w:r>
         <w:rPr>
           <w:w w:val="99"/>
@@ -14674,21 +14537,7 @@
         <w:rPr>
           <w:spacing w:val="1"/>
         </w:rPr>
-        <w:t xml:space="preserve">In the same way, we need </w:t>
-      </w:r>
-      <w:proofErr w:type="gramStart"/>
-      <w:r>
-        <w:rPr>
-          <w:spacing w:val="1"/>
-        </w:rPr>
-        <w:t>be</w:t>
-      </w:r>
-      <w:proofErr w:type="gramEnd"/>
-      <w:r>
-        <w:rPr>
-          <w:spacing w:val="1"/>
-        </w:rPr>
-        <w:t xml:space="preserve"> able to read and understand basic programming before we use tools to create programs.</w:t>
+        <w:t>In the same way, we need be able to read and understand basic programming before we use tools to create programs.</w:t>
       </w:r>
     </w:p>
     <w:p>
@@ -14780,21 +14629,7 @@
         <w:rPr>
           <w:spacing w:val="1"/>
         </w:rPr>
-        <w:t xml:space="preserve">You can also copy and paste your code into the duck debugger and ask </w:t>
-      </w:r>
-      <w:proofErr w:type="gramStart"/>
-      <w:r>
-        <w:rPr>
-          <w:spacing w:val="1"/>
-        </w:rPr>
-        <w:t>why it</w:t>
-      </w:r>
-      <w:proofErr w:type="gramEnd"/>
-      <w:r>
-        <w:rPr>
-          <w:spacing w:val="1"/>
-        </w:rPr>
-        <w:t xml:space="preserve"> your program is crashing at a certain place.</w:t>
+        <w:t>You can also copy and paste your code into the duck debugger and ask why it your program is crashing at a certain place.</w:t>
       </w:r>
       <w:r>
         <w:rPr>
@@ -14890,25 +14725,7 @@
           <w:iCs/>
           <w:spacing w:val="1"/>
         </w:rPr>
-        <w:t xml:space="preserve">Note, you will have to create a free account with </w:t>
-      </w:r>
-      <w:proofErr w:type="spellStart"/>
-      <w:r>
-        <w:rPr>
-          <w:bCs/>
-          <w:iCs/>
-          <w:spacing w:val="1"/>
-        </w:rPr>
-        <w:t>github</w:t>
-      </w:r>
-      <w:proofErr w:type="spellEnd"/>
-      <w:r>
-        <w:rPr>
-          <w:bCs/>
-          <w:iCs/>
-          <w:spacing w:val="1"/>
-        </w:rPr>
-        <w:t xml:space="preserve"> to log into the Duck Debugger.</w:t>
+        <w:t>Note, you will have to create a free account with github to log into the Duck Debugger.</w:t>
       </w:r>
     </w:p>
     <w:p>
@@ -15197,7 +15014,6 @@
         </w:rPr>
         <w:t xml:space="preserve"> </w:t>
       </w:r>
-      <w:proofErr w:type="gramStart"/>
       <w:r>
         <w:rPr>
           <w:spacing w:val="-2"/>
@@ -15216,7 +15032,6 @@
       <w:r>
         <w:t>k</w:t>
       </w:r>
-      <w:proofErr w:type="gramEnd"/>
       <w:r>
         <w:rPr>
           <w:spacing w:val="-4"/>
@@ -15259,7 +15074,6 @@
         </w:rPr>
         <w:t xml:space="preserve"> </w:t>
       </w:r>
-      <w:proofErr w:type="gramStart"/>
       <w:r>
         <w:t>a</w:t>
       </w:r>
@@ -15272,7 +15086,6 @@
       <w:r>
         <w:t>o</w:t>
       </w:r>
-      <w:proofErr w:type="gramEnd"/>
       <w:r>
         <w:rPr>
           <w:spacing w:val="-3"/>
@@ -15785,21 +15598,7 @@
         <w:rPr>
           <w:spacing w:val="-3"/>
         </w:rPr>
-        <w:t xml:space="preserve">are </w:t>
-      </w:r>
-      <w:proofErr w:type="gramStart"/>
-      <w:r>
-        <w:rPr>
-          <w:spacing w:val="-3"/>
-        </w:rPr>
-        <w:t>actually encouraged</w:t>
-      </w:r>
-      <w:proofErr w:type="gramEnd"/>
-      <w:r>
-        <w:rPr>
-          <w:spacing w:val="-3"/>
-        </w:rPr>
-        <w:t xml:space="preserve"> to work on your own laptop or computer.  Having your own computer will greatly aid you in the computer science major, and the computer/laptop itself does not have to be very expensive.  The class software is free and will work with Windows, OSX, and Linux.  </w:t>
+        <w:t xml:space="preserve">are actually encouraged to work on your own laptop or computer.  Having your own computer will greatly aid you in the computer science major, and the computer/laptop itself does not have to be very expensive.  The class software is free and will work with Windows, OSX, and Linux.  </w:t>
       </w:r>
       <w:r>
         <w:rPr>
@@ -16658,23 +16457,7 @@
           <w:b/>
           <w:spacing w:val="1"/>
         </w:rPr>
-        <w:t xml:space="preserve"> you turn in for </w:t>
-      </w:r>
-      <w:proofErr w:type="spellStart"/>
-      <w:r>
-        <w:rPr>
-          <w:b/>
-          <w:spacing w:val="1"/>
-        </w:rPr>
-        <w:t>homeworks</w:t>
-      </w:r>
-      <w:proofErr w:type="spellEnd"/>
-      <w:r>
-        <w:rPr>
-          <w:b/>
-          <w:spacing w:val="1"/>
-        </w:rPr>
-        <w:t xml:space="preserve"> or labs, it doesn’t count.  </w:t>
+        <w:t xml:space="preserve"> you turn in for homeworks or labs, it doesn’t count.  </w:t>
       </w:r>
     </w:p>
     <w:p>
@@ -16842,21 +16625,7 @@
         <w:rPr>
           <w:spacing w:val="1"/>
         </w:rPr>
-        <w:t xml:space="preserve"> there are </w:t>
-      </w:r>
-      <w:proofErr w:type="gramStart"/>
-      <w:r>
-        <w:rPr>
-          <w:spacing w:val="1"/>
-        </w:rPr>
-        <w:t>many different ways</w:t>
-      </w:r>
-      <w:proofErr w:type="gramEnd"/>
-      <w:r>
-        <w:rPr>
-          <w:spacing w:val="1"/>
-        </w:rPr>
-        <w:t xml:space="preserve"> to write an essay addressing a particular topic.  After a certain point in the course, I will be using plagiarism-detection software to detect similarities that are very unlikely to occur if students were working alone.</w:t>
+        <w:t xml:space="preserve"> there are many different ways to write an essay addressing a particular topic.  After a certain point in the course, I will be using plagiarism-detection software to detect similarities that are very unlikely to occur if students were working alone.</w:t>
       </w:r>
     </w:p>
     <w:p>
@@ -17155,21 +16924,7 @@
         <w:rPr>
           <w:spacing w:val="1"/>
         </w:rPr>
-        <w:t xml:space="preserve">DO try to help them </w:t>
-      </w:r>
-      <w:proofErr w:type="gramStart"/>
-      <w:r>
-        <w:rPr>
-          <w:spacing w:val="1"/>
-        </w:rPr>
-        <w:t>in</w:t>
-      </w:r>
-      <w:proofErr w:type="gramEnd"/>
-      <w:r>
-        <w:rPr>
-          <w:spacing w:val="1"/>
-        </w:rPr>
-        <w:t xml:space="preserve"> words, similar examples from lectures and labs, and diagrams.</w:t>
+        <w:t>DO try to help them in words, similar examples from lectures and labs, and diagrams.</w:t>
       </w:r>
     </w:p>
     <w:p>

</xml_diff>